<commit_message>
Report full source dataset sizes in manuscript table
</commit_message>
<xml_diff>
--- a/docs/Bora_MIA_pilot_manuscript.docx
+++ b/docs/Bora_MIA_pilot_manuscript.docx
@@ -912,17 +912,7 @@
         <w:t>three primary benchmark datasets and 63 distinct annotated image/mask ROIs</w:t>
       </w:r>
       <w:r>
-        <w:t xml:space="preserve">: 12 BCSS breast ROIs from the dataset described by Amgad et al. (2019) and acquired through the MedOtter (2026a) mirror, 15 TIGER breast ROIs (TIGER Grand Challenge, 2022), and 36 WSSS4LUAD lung ROIs from the challenge described by Han et al. (2022) and acquired through the MedOtter (2026b) mirror. Each dataset contributes one ROI to the initial pilot; the descriptive extensions add 11 BCSS, 14 TIGER and 35 WSSS4LUAD ROIs. These are image counts, not numbers of tile-size/error-rate runs. The ten newly added TIGER and eight newly added BCSS ROIs come from distinct unused source groups and were tested at three widths with zero requested error. Bora's tested </w:t>
-      </w:r>
-      <w:r>
-        <w:rPr>
-          <w:rFonts w:ascii="Consolas" w:hAnsi="Consolas"/>
-          <w:sz w:val="18"/>
-        </w:rPr>
-        <w:t>adaptive-wand</w:t>
-      </w:r>
-      <w:r>
-        <w:t xml:space="preserve"> algorithm was not fitted to any of these images: its training count is zero. We report the 63 images as analyzed or evaluated, not as an independent blind test cohort. The 36 WSSS4LUAD images belong to the source validation split, while the acquired BCSS and TIGER inventories have no provider-assigned held-out split.</w:t>
+        <w:t>: 12 BCSS breast ROIs from the dataset described by Amgad et al. (2019) and acquired through the MedOtter (2026a) mirror, 15 TIGER breast ROIs (TIGER Grand Challenge, 2022), and 36 WSSS4LUAD lung ROIs from the challenge described by Han et al. (2022) and acquired through the MedOtter (2026b) mirror. Each dataset contributes one ROI to the initial pilot; the descriptive extensions add 11 BCSS, 14 TIGER and 35 WSSS4LUAD ROIs. These are image counts, not numbers of tile-size/error-rate runs. The ten newly added TIGER and eight newly added BCSS ROIs come from distinct unused source groups and were tested at three widths with zero requested error. We report the 63 images as analyzed or evaluated, not as an independent blind test cohort. The 36 WSSS4LUAD images belong to the source validation split, while the acquired BCSS and TIGER inventories have no provider-assigned held-out split.</w:t>
       </w:r>
     </w:p>
     <w:p>
@@ -936,7 +926,7 @@
         <w:t>Table 1.</w:t>
       </w:r>
       <w:r>
-        <w:t xml:space="preserve"> Source repositories, released partitions and numbers of images used in the Bora study. “Evaluated” counts unique images; repeat tile settings do not create new test images.</w:t>
+        <w:t xml:space="preserve"> Size of each complete acquired dataset, source partitions and numbers of images evaluated with Bora. Dataset size counts source images or ROIs, not repeated tile settings or independent patients. “Evaluated” counts unique annotated images.</w:t>
       </w:r>
     </w:p>
     <w:tbl>
@@ -955,10 +945,10 @@
       </w:tblPr>
       <w:tblGrid>
         <w:gridCol w:w="1584"/>
-        <w:gridCol w:w="2664"/>
-        <w:gridCol w:w="3240"/>
-        <w:gridCol w:w="936"/>
-        <w:gridCol w:w="1368"/>
+        <w:gridCol w:w="2520"/>
+        <w:gridCol w:w="2952"/>
+        <w:gridCol w:w="1512"/>
+        <w:gridCol w:w="1224"/>
       </w:tblGrid>
       <w:tr>
         <w:trPr>
@@ -987,7 +977,7 @@
         </w:tc>
         <w:tc>
           <w:tcPr>
-            <w:tcW w:type="dxa" w:w="2664"/>
+            <w:tcW w:type="dxa" w:w="2520"/>
             <w:vAlign w:val="center"/>
             <w:tcBorders>
               <w:bottom w:val="single" w:sz="5" w:color="666666"/>
@@ -1008,7 +998,7 @@
         </w:tc>
         <w:tc>
           <w:tcPr>
-            <w:tcW w:type="dxa" w:w="3240"/>
+            <w:tcW w:type="dxa" w:w="2952"/>
             <w:vAlign w:val="center"/>
             <w:tcBorders>
               <w:bottom w:val="single" w:sz="5" w:color="666666"/>
@@ -1023,13 +1013,13 @@
                 <w:b/>
                 <w:sz w:val="18"/>
               </w:rPr>
-              <w:t>Acquired source images and split</w:t>
+              <w:t>Source partitions and annotation status</w:t>
             </w:r>
           </w:p>
         </w:tc>
         <w:tc>
           <w:tcPr>
-            <w:tcW w:type="dxa" w:w="936"/>
+            <w:tcW w:type="dxa" w:w="1512"/>
             <w:vAlign w:val="center"/>
             <w:tcBorders>
               <w:bottom w:val="single" w:sz="5" w:color="666666"/>
@@ -1045,13 +1035,13 @@
                 <w:b/>
                 <w:sz w:val="18"/>
               </w:rPr>
-              <w:t>Bora train</w:t>
+              <w:t>Entire acquired dataset</w:t>
             </w:r>
           </w:p>
         </w:tc>
         <w:tc>
           <w:tcPr>
-            <w:tcW w:type="dxa" w:w="1368"/>
+            <w:tcW w:type="dxa" w:w="1224"/>
             <w:vAlign w:val="center"/>
             <w:tcBorders>
               <w:bottom w:val="single" w:sz="5" w:color="666666"/>
@@ -1092,7 +1082,7 @@
         </w:tc>
         <w:tc>
           <w:tcPr>
-            <w:tcW w:type="dxa" w:w="2664"/>
+            <w:tcW w:type="dxa" w:w="2520"/>
             <w:vAlign w:val="center"/>
           </w:tcPr>
           <w:p>
@@ -1109,7 +1099,7 @@
         </w:tc>
         <w:tc>
           <w:tcPr>
-            <w:tcW w:type="dxa" w:w="3240"/>
+            <w:tcW w:type="dxa" w:w="2952"/>
             <w:vAlign w:val="center"/>
           </w:tcPr>
           <w:p>
@@ -1120,13 +1110,13 @@
               <w:rPr>
                 <w:sz w:val="18"/>
               </w:rPr>
-              <w:t>151 dense ROI pairs; unsplit</w:t>
+              <w:t>Dense ROI pairs; unsplit</w:t>
             </w:r>
           </w:p>
         </w:tc>
         <w:tc>
           <w:tcPr>
-            <w:tcW w:type="dxa" w:w="936"/>
+            <w:tcW w:type="dxa" w:w="1512"/>
             <w:vAlign w:val="center"/>
           </w:tcPr>
           <w:p>
@@ -1138,13 +1128,13 @@
               <w:rPr>
                 <w:sz w:val="18"/>
               </w:rPr>
-              <w:t>0</w:t>
+              <w:t>151 ROIs</w:t>
             </w:r>
           </w:p>
         </w:tc>
         <w:tc>
           <w:tcPr>
-            <w:tcW w:type="dxa" w:w="1368"/>
+            <w:tcW w:type="dxa" w:w="1224"/>
             <w:vAlign w:val="center"/>
           </w:tcPr>
           <w:p>
@@ -1181,7 +1171,7 @@
         </w:tc>
         <w:tc>
           <w:tcPr>
-            <w:tcW w:type="dxa" w:w="2664"/>
+            <w:tcW w:type="dxa" w:w="2520"/>
             <w:vAlign w:val="center"/>
           </w:tcPr>
           <w:p>
@@ -1198,7 +1188,7 @@
         </w:tc>
         <w:tc>
           <w:tcPr>
-            <w:tcW w:type="dxa" w:w="3240"/>
+            <w:tcW w:type="dxa" w:w="2952"/>
             <w:vAlign w:val="center"/>
           </w:tcPr>
           <w:p>
@@ -1209,13 +1199,13 @@
               <w:rPr>
                 <w:sz w:val="18"/>
               </w:rPr>
-              <w:t>2,030 ROI pairs from 195 source WSIs; unsplit</w:t>
+              <w:t>ROI pairs from 195 source WSIs; unsplit</w:t>
             </w:r>
           </w:p>
         </w:tc>
         <w:tc>
           <w:tcPr>
-            <w:tcW w:type="dxa" w:w="936"/>
+            <w:tcW w:type="dxa" w:w="1512"/>
             <w:vAlign w:val="center"/>
           </w:tcPr>
           <w:p>
@@ -1227,13 +1217,13 @@
               <w:rPr>
                 <w:sz w:val="18"/>
               </w:rPr>
-              <w:t>0</w:t>
+              <w:t>2,030 ROIs</w:t>
             </w:r>
           </w:p>
         </w:tc>
         <w:tc>
           <w:tcPr>
-            <w:tcW w:type="dxa" w:w="1368"/>
+            <w:tcW w:type="dxa" w:w="1224"/>
             <w:vAlign w:val="center"/>
           </w:tcPr>
           <w:p>
@@ -1270,7 +1260,7 @@
         </w:tc>
         <w:tc>
           <w:tcPr>
-            <w:tcW w:type="dxa" w:w="2664"/>
+            <w:tcW w:type="dxa" w:w="2520"/>
             <w:vAlign w:val="center"/>
           </w:tcPr>
           <w:p>
@@ -1287,7 +1277,7 @@
         </w:tc>
         <w:tc>
           <w:tcPr>
-            <w:tcW w:type="dxa" w:w="3240"/>
+            <w:tcW w:type="dxa" w:w="2952"/>
             <w:vAlign w:val="center"/>
           </w:tcPr>
           <w:p>
@@ -1304,7 +1294,7 @@
         </w:tc>
         <w:tc>
           <w:tcPr>
-            <w:tcW w:type="dxa" w:w="936"/>
+            <w:tcW w:type="dxa" w:w="1512"/>
             <w:vAlign w:val="center"/>
           </w:tcPr>
           <w:p>
@@ -1316,13 +1306,13 @@
               <w:rPr>
                 <w:sz w:val="18"/>
               </w:rPr>
-              <w:t>0</w:t>
+              <w:t>10,211 images</w:t>
             </w:r>
           </w:p>
         </w:tc>
         <w:tc>
           <w:tcPr>
-            <w:tcW w:type="dxa" w:w="1368"/>
+            <w:tcW w:type="dxa" w:w="1224"/>
             <w:vAlign w:val="center"/>
           </w:tcPr>
           <w:p>

</xml_diff>

<commit_message>
Document dataset retrieval and relevant Medical Image Analysis literature
</commit_message>
<xml_diff>
--- a/docs/Bora_MIA_pilot_manuscript.docx
+++ b/docs/Bora_MIA_pilot_manuscript.docx
@@ -666,7 +666,7 @@
     </w:p>
     <w:p>
       <w:r>
-        <w:t>Pixel classifiers and foundation-model-derived dense predictors learn semantic classes from annotated examples (Lv et al., 2026). Tile embeddings from UNI (Chen et al., 2024), UNI2 (Mahmood Lab, 2025) and Virchow2 (Zimmermann et al., 2024) support self-supervised tissue grouping across large slides, but a cluster ID is not itself a validated tissue class. When group labels are projected to the image, the tile footprint quantizes every interface.</w:t>
+        <w:t>Pixel classifiers and foundation-model-derived dense predictors learn semantic classes from annotated examples (Lv et al., 2026). Representative-tile sampling has also supported whole-slide diagnosis (Barker et al., 2016), but a slide-level classifier does not locate the interfaces between tissue compartments. Tile embeddings from UNI (Chen et al., 2024), UNI2 (Mahmood Lab, 2025) and Virchow2 (Zimmermann et al., 2024) support self-supervised tissue grouping across large slides, but a cluster ID is not itself a validated tissue class. When group labels are projected to the image, the tile footprint quantizes every interface.</w:t>
       </w:r>
     </w:p>
     <w:p>
@@ -705,7 +705,7 @@
     </w:p>
     <w:p>
       <w:r>
-        <w:t>Existing prompt-based and dense prediction methods do not by themselves solve the practical task of geometrically revising an already assigned, potentially unnamed multiclass tile map. Classical boundary methods can improve edge placement but may erase narrow classes or introduce artifacts without class-aware constraints. Bora treats the supplied labels as a prior and refines their interfaces using local colour evidence; semantic validation remains an independent requirement.</w:t>
+        <w:t>Existing prompt-based and dense prediction methods do not by themselves solve the practical task of geometrically revising an already assigned, potentially unnamed multiclass tile map. Classical boundary methods can improve edge placement but may erase narrow classes or introduce artifacts without class-aware constraints. Stain variation across centres can also change image appearance (Hetz et al., 2024), which may affect a refinement cost based on local colour. Bora treats the supplied labels as a prior and refines their interfaces using local colour evidence; semantic validation remains an independent requirement.</w:t>
       </w:r>
     </w:p>
     <w:p>
@@ -872,7 +872,7 @@
     </w:p>
     <w:p>
       <w:r>
-        <w:t>The pilot runner fixes the three sample IDs and seed, records the inventory row and class remapping, and resumes completed conditions without changing source files. The extension scripts record their selection rules and source identifiers. Companion scripts produce result CSVs, plots and the class pair boundary audit. The ground truth masks, original images and acquisition hashes remain unmodified. Output provenance files record the Bora Git HEAD, a dirty-worktree flag, SHA256 values for the relevant local source files and tiling-mask executable, package versions and CPU model. Because the current working tree includes uncommitted benchmark code, the Git HEAD alone does not reproduce these runs. The scripts and derived results have not yet been archived in a public release.</w:t>
+        <w:t>The pilot runner fixes the three sample IDs and seed, records the inventory row and class remapping, and resumes completed conditions without changing source files. The extension scripts record their selection rules and source identifiers. Companion scripts produce result CSVs, plots and the class-pair boundary audit. The reference masks, original images and acquisition hashes remain unmodified. Output provenance files record the Bora Git HEAD, a dirty-worktree flag, SHA256 values for the relevant local source files and tiling-mask executable, package versions and CPU model. Benchmark scripts are published in Bora-extra, but the runs predate that repository split; exact reproduction requires a tagged snapshot of the run-time code and executable together with the still-local derived outputs.</w:t>
       </w:r>
     </w:p>
     <w:p>
@@ -1333,22 +1333,102 @@
     <w:p/>
     <w:p>
       <w:r>
-        <w:t xml:space="preserve">The acquired BCSS mirror (MedOtter, 2026a) and WSSS4LUAD mirror (MedOtter, 2026b) were pinned to specific revisions; TIGER data came from its recorded release (TIGER Grand Challenge, 2022). The acquisition code stores image/mask paths, hashes, source IDs, label definitions, and split information in JSONL inventories under </w:t>
+        <w:t xml:space="preserve">BCSS image and mask files were retrieved from the MedOtter/BCSS Hugging Face mirror (https://huggingface.co/datasets/MedOtter/BCSS; revision </w:t>
       </w:r>
       <w:r>
         <w:rPr>
           <w:rFonts w:ascii="Consolas" w:hAnsi="Consolas"/>
           <w:sz w:val="18"/>
         </w:rPr>
-        <w:t>/mnt/sata_ssd/Bora-benchmark/prepared/</w:t>
+        <w:t>502d4a3fbc77dbaca6f4664c19e2379ff077d418</w:t>
       </w:r>
       <w:r>
-        <w:t>. The WSSS4LUAD training patches have image-level labels rather than dense segmentation masks and were not used to train or evaluate Bora. Its 80 received test ROIs were excluded because 10 dense masks were absent and 70 disagreed with their RGB dimensions. Four of the 40 geometrically valid validation ROIs had only one observed valid tissue class and were excluded from the multiclass analysis.</w:t>
+        <w:t xml:space="preserve">), rather than directly from the upstream BCSS project (MedOtter, 2026a). The mirror describes its RGB images as colour normalized. TIGER ROI images and annotations were retrieved as </w:t>
+      </w:r>
+      <w:r>
+        <w:rPr>
+          <w:rFonts w:ascii="Consolas" w:hAnsi="Consolas"/>
+          <w:sz w:val="18"/>
+        </w:rPr>
+        <w:t>roi-level-annotations.zip</w:t>
+      </w:r>
+      <w:r>
+        <w:t xml:space="preserve"> from Zenodo record 6014422 (https://doi.org/10.5281/zenodo.6014422; TIGER Grand Challenge, 2022). WSSS4LUAD files were retrieved from the MedOtter/WSSS4LUAD-v2 Hugging Face mirror (https://huggingface.co/datasets/MedOtter/WSSS4LUAD-v2; revision </w:t>
+      </w:r>
+      <w:r>
+        <w:rPr>
+          <w:rFonts w:ascii="Consolas" w:hAnsi="Consolas"/>
+          <w:sz w:val="18"/>
+        </w:rPr>
+        <w:t>aa035a16f230622a17f51bc6b5180209a04bec7b</w:t>
+      </w:r>
+      <w:r>
+        <w:t xml:space="preserve">; MedOtter, 2026b). Acquisition was recorded on 15 October 2026. The acquisition code stores file hashes, image/mask paths, source IDs, label definitions and split information in the benchmark's </w:t>
+      </w:r>
+      <w:r>
+        <w:rPr>
+          <w:rFonts w:ascii="Consolas" w:hAnsi="Consolas"/>
+          <w:sz w:val="18"/>
+        </w:rPr>
+        <w:t>prepared/*.jsonl</w:t>
+      </w:r>
+      <w:r>
+        <w:t xml:space="preserve"> inventories. The WSSS4LUAD training patches have image-level labels rather than dense segmentation masks and were not used to train or evaluate Bora. Its 80 received test ROIs were excluded because 10 dense masks were absent and 70 disagreed with their RGB dimensions. Four of the 40 geometrically valid validation ROIs had only one observed valid tissue class and were excluded from the multiclass analysis.</w:t>
       </w:r>
     </w:p>
     <w:p>
       <w:r>
-        <w:t>Two further sources supply tissue-region masks under distinct endpoints: RINGS manual prostate tumour annotations over three selected RGB images (Salvi et al., 2021) and three expert-derived CAMELYON16 tumour annotations in 4096 × 4096 native windows from three acquired complete slides (Radboud University Medical Center, 2026). The negative RINGS tumour mask is not an annotated stroma class. CAMELYON16 normal tissue was automatically detected, not expert classified. Neither small exploratory subset is pooled with the primary multiclass ROI analysis in Table 1, and the window tests are not complete-slide runs.</w:t>
+        <w:t xml:space="preserve">Two further sources supply tissue-region masks under distinct endpoints. RINGS prostate tumour images and </w:t>
+      </w:r>
+      <w:r>
+        <w:rPr>
+          <w:rFonts w:ascii="Consolas" w:hAnsi="Consolas"/>
+          <w:sz w:val="18"/>
+        </w:rPr>
+        <w:t>MANUAL TUMOR</w:t>
+      </w:r>
+      <w:r>
+        <w:t xml:space="preserve"> annotations were retrieved from the publisher's Mendeley Data version 1 (https://doi.org/10.17632/h8bdwrtnr5.1; Salvi et al., 2021). The negative RINGS tumour mask is not an annotated stroma class.</w:t>
+      </w:r>
+    </w:p>
+    <w:p>
+      <w:r>
+        <w:t xml:space="preserve">Three CAMELYON16 complete slides, tumour masks and XML annotations for cases </w:t>
+      </w:r>
+      <w:r>
+        <w:rPr>
+          <w:rFonts w:ascii="Consolas" w:hAnsi="Consolas"/>
+          <w:sz w:val="18"/>
+        </w:rPr>
+        <w:t>tumor_058</w:t>
+      </w:r>
+      <w:r>
+        <w:t xml:space="preserve">, </w:t>
+      </w:r>
+      <w:r>
+        <w:rPr>
+          <w:rFonts w:ascii="Consolas" w:hAnsi="Consolas"/>
+          <w:sz w:val="18"/>
+        </w:rPr>
+        <w:t>tumor_091</w:t>
+      </w:r>
+      <w:r>
+        <w:t xml:space="preserve"> and </w:t>
+      </w:r>
+      <w:r>
+        <w:rPr>
+          <w:rFonts w:ascii="Consolas" w:hAnsi="Consolas"/>
+          <w:sz w:val="18"/>
+        </w:rPr>
+        <w:t>tumor_107</w:t>
+      </w:r>
+      <w:r>
+        <w:t xml:space="preserve"> were retrieved through the Registry of Open Data on AWS (https://registry.opendata.aws/camelyon/; Radboud University Medical Center, 2026). Bora was evaluated on 4096 × 4096 native windows from these slides.</w:t>
+      </w:r>
+    </w:p>
+    <w:p>
+      <w:r>
+        <w:t>CAMELYON16 normal tissue was automatically detected, not expert classified. Neither small exploratory subset is pooled with the primary multiclass ROI analysis in Table 1, and the window tests are not complete-slide runs.</w:t>
       </w:r>
     </w:p>
     <w:p>
@@ -5335,12 +5415,12 @@
     </w:p>
     <w:p>
       <w:r>
-        <w:t>The next experiment should use complete WSIs with coarse masks generated independently from UNI2 (Mahmood Lab, 2025) or Virchow2 (Zimmermann et al., 2024) features, fixing cluster-to-tissue interpretation without test annotations so Bora's geometric contribution can be isolated. It should include case-disjoint slides, verified physical spacing and mask encoding, and full-slide wall time, peak memory, CPU use, worker scaling and block-seam measurements. Method development could compare stain-normalized or texture-aware costs, multiscale edge evidence and topology-aware treatment of narrow regions against graph cuts (Boykov and Jolly, 2001), active contours (Chan and Vese, 2001) and dense conditional random fields (Krähenbühl and Koltun, 2011), accepting changes on held-out boundary and overlap metrics rather than smoothness alone.</w:t>
+        <w:t>The next experiment should use complete WSIs with coarse masks generated independently from UNI2 (Mahmood Lab, 2025) or Virchow2 (Zimmermann et al., 2024) features, fixing cluster-to-tissue interpretation without test annotations so Bora's geometric contribution can be isolated. It should include case-disjoint slides, verified physical spacing and mask encoding, and full-slide wall time, peak memory, CPU use, worker scaling and block-seam measurements. Image resolution affects pathology classification (Neary-Zajiczek et al., 2023), and magnification sampling affects foundation-model representations (Möllers et al., 2026); neither result establishes a resolution optimum for Bora's boundary task. A future Bora study should therefore stratify boundary scores by measured pixel spacing and tile width in micrometres. Method development could compare stain-normalized or texture-aware costs, multiscale edge evidence and topology-aware treatment of narrow regions against graph cuts (Boykov and Jolly, 2001), active contours (Chan and Vese, 2001) and dense conditional random fields (Krähenbühl and Koltun, 2011), accepting changes on held-out boundary and overlap metrics rather than smoothness alone.</w:t>
       </w:r>
     </w:p>
     <w:p>
       <w:r>
-        <w:t>Expression-based clusters in spatial transcriptomics (Ståhl et al., 2016) offer a separate possible application. After accurate registration of a Visium spot grid (10x Genomics, n.d.-a) or Visium HD bin grid (10x Genomics, n.d.-b) to its H&amp;E image, cluster assignments could be represented as a coarse categorical map. Bora could then be evaluated for morphology-guided refinement of interfaces supported by the image; conversely, Bora-refined histology regions could provide spatial context for interpreting expression clusters. Such analysis would require an explicit rule for mapping spots or bins to image pixels and an independent assessment of registration error and biological agreement. Refining a histological boundary cannot increase molecular resolution or establish the identity of an expression cluster. No spatial transcriptomics data were analyzed in the present study.</w:t>
+        <w:t>Expression-based clusters in spatial transcriptomics (Ståhl et al., 2016) offer a separate possible application. SPADE (Redekop et al., 2026) demonstrates that paired histology and spatial transcriptomics can inform image representations, but it does not evaluate refinement of a supplied categorical spot map. After accurate registration of a Visium spot grid (10x Genomics, n.d.-a) or Visium HD bin grid (10x Genomics, n.d.-b) to its H&amp;E image, cluster assignments could be represented as a coarse categorical map. Bora could then be evaluated for morphology-guided refinement of interfaces supported by the image; conversely, Bora-refined histology regions could provide spatial context for interpreting expression clusters. Such analysis would require an explicit rule for mapping spots or bins to image pixels and an independent assessment of registration error and biological agreement. Refining a histological boundary cannot increase molecular resolution or establish the identity of an expression cluster. No spatial transcriptomics data were analyzed in the present study.</w:t>
       </w:r>
     </w:p>
     <w:p>
@@ -5394,6 +5474,11 @@
     </w:p>
     <w:p>
       <w:r>
+        <w:t>Barker, J., Hoogi, A., Depeursinge, A., Rubin, D.L., 2016. Automated classification of brain tumor type in whole-slide digital pathology images using local representative tiles. Medical Image Analysis 30, 60–71. https://doi.org/10.1016/j.media.2015.12.002.</w:t>
+      </w:r>
+    </w:p>
+    <w:p>
+      <w:r>
         <w:t>Boykov, Y.Y., Jolly, M.-P., 2001. Interactive graph cuts for optimal boundary and region segmentation of objects in N-D images. Proceedings of the IEEE International Conference on Computer Vision, 105–112. https://doi.org/10.1109/ICCV.2001.937505.</w:t>
       </w:r>
     </w:p>
@@ -5415,6 +5500,11 @@
     <w:p>
       <w:r>
         <w:t>Han, C., Pan, X., Yan, L., et al., 2022. WSSS4LUAD: Grand Challenge on Weakly-supervised Tissue Semantic Segmentation for Lung Adenocarcinoma. arXiv preprint arXiv:2204.06455. https://arxiv.org/abs/2204.06455.</w:t>
+      </w:r>
+    </w:p>
+    <w:p>
+      <w:r>
+        <w:t>Hetz, M.J., Bucher, T.-C., Brinker, T.J., 2024. Multi-domain stain normalization for digital pathology: A cycle-consistent adversarial network for whole slide images. Medical Image Analysis 94, 103149. https://doi.org/10.1016/j.media.2024.103149.</w:t>
       </w:r>
     </w:p>
     <w:p>
@@ -5449,7 +5539,22 @@
     </w:p>
     <w:p>
       <w:r>
+        <w:t>Möllers, A., Hense, J., Schulz, F., Milbich, T., Alber, M., Ruff, L., 2026. Mind the gap: Continuous magnification sampling for pathology foundation models. Medical Image Analysis, article 104327, advance online publication. https://doi.org/10.1016/j.media.2026.104327.</w:t>
+      </w:r>
+    </w:p>
+    <w:p>
+      <w:r>
+        <w:t>Neary-Zajiczek, L., Beresna, L., Razavi, B., Pawar, V., Shaw, M., Stoyanov, D., 2023. Minimum resolution requirements of digital pathology images for accurate classification. Medical Image Analysis 89, 102891. https://doi.org/10.1016/j.media.2023.102891.</w:t>
+      </w:r>
+    </w:p>
+    <w:p>
+      <w:r>
         <w:t>Radboud University Medical Center, 2026. CAncer MEtastases in LYmph nOdes challeNge (CAMELYON) dataset. Registry of Open Data on AWS. https://registry.opendata.aws/camelyon/ (accessed 16 October 2026).</w:t>
+      </w:r>
+    </w:p>
+    <w:p>
+      <w:r>
+        <w:t>Redekop, E., Pleasure, M., Wang, Z., et al., 2026. SPADE: Spatial transcriptomics and pathology alignment using a mixture of data experts for an expressive latent space. Medical Image Analysis 113, 104197. https://doi.org/10.1016/j.media.2026.104197.</w:t>
       </w:r>
     </w:p>
     <w:p>

</xml_diff>